<commit_message>
Strip AI-typographic artifacts from all exam files; fix exam docx
- Exam .docx rebuilt via the proper template assembler (formula sheet
  restored, real RTL, page breaks, hanging indents).
- Removed em/en-dashes, curly quotes, ellipsis, middot separators,
  warning/decorative emoji, and connective arrows from exams, solution
  pages, diagrams, README and index; rewritten as natural Hebrew.
- Kept UML notation only (stereotypes, composition/multiplicity
  depictions, diagram-transition arrows, legend tether).

Co-Authored-By: Claude Opus 4.8 <noreply@anthropic.com>
</commit_message>
<xml_diff>
--- a/2026-2-sample-1/2026-2-sample-1-exam.docx
+++ b/2026-2-sample-1/2026-2-sample-1-exam.docx
@@ -662,7 +662,7 @@
           <w:szCs w:val="24"/>
           <w:rtl/>
         </w:rPr>
-        <w:t xml:space="preserve">התהליך העסקי המתואר כאן הוא בדיקת היציאה של דייר מחדרו והחזר הפיקדון שהפקיד. הוא מתחיל כאשר הדייר היוצא מגיש למערכת הודעת עזיבה, ומסתיים כאשר הפיקדון, בניכוי החיובים שנצברו, מועבר לחשבון הדייר והוא מקבל אישור — או, לחלופין, כאשר הפיקדון מומש במלואו לכיסוי הנזקים ותיק החדר נסגר ללא החזר.</w:t>
+        <w:t xml:space="preserve">התהליך העסקי המתואר כאן הוא בדיקת היציאה של דייר מחדרו והחזר הפיקדון שהפקיד. הוא מתחיל כאשר הדייר היוצא מגיש למערכת הודעת עזיבה, ומסתיים כאשר הפיקדון, בניכוי החיובים שנצברו, מועבר לחשבון הדייר והוא מקבל אישור, או לחלופין כאשר הפיקדון מומש במלואו לכיסוי הנזקים ותיק החדר נסגר ללא החזר.</w:t>
       </w:r>
     </w:p>
     <w:p>
@@ -716,7 +716,7 @@
           <w:szCs w:val="24"/>
           <w:rtl/>
         </w:rPr>
-        <w:t xml:space="preserve">אחרת שולחת המערכת לדייר את פירוט הניכויים. אם הדייר מערער על הפירוט בתוך שבעה ימים, מבצע המפקח בדיקה חוזרת בנוכחותו, מעדכן את אומדן העלות, והאומדן המעודכן נבחן שוב מול סכום הפיקדון. אם לא הוגש ערעור, מחשבת המערכת את סכום ההחזר נטו — הפיקדון בניכוי עלות הנזקים ודמי ההודעה המוקדמת — שולחת לבנק הוראת תשלום וממתינה לאישור ביצוע ההעברה. עם קבלת האישור מעדכנת המערכת את סטטוס הפיקדון במאגר ל"הוחזר", שולחת אישור לדייר, והתהליך מסתיים.</w:t>
+        <w:t xml:space="preserve">אחרת שולחת המערכת לדייר את פירוט הניכויים. אם הדייר מערער על הפירוט בתוך שבעה ימים, מבצע המפקח בדיקה חוזרת בנוכחותו, מעדכן את אומדן העלות, והאומדן המעודכן נבחן שוב מול סכום הפיקדון. אם לא הוגש ערעור, מחשבת המערכת את סכום ההחזר נטו, כלומר הפיקדון בניכוי עלות הנזקים ודמי ההודעה המוקדמת, ושולחת לבנק הוראת תשלום וממתינה לאישור ביצוע ההעברה. עם קבלת האישור מעדכנת המערכת את סטטוס הפיקדון במאגר ל"הוחזר", שולחת אישור לדייר, והתהליך מסתיים.</w:t>
       </w:r>
     </w:p>
     <w:p>
@@ -772,7 +772,7 @@
           <w:szCs w:val="24"/>
           <w:rtl/>
         </w:rPr>
-        <w:t xml:space="preserve">1.2 (3 נק') בתהליך משתתפים, לצד חברת הניהול, גם הדייר היוצא וגם הבנק. כיצד ייצגתם בתרשים שלכם את התהליך הפנימי של כל אחד משני המשתתפים הללו, ובאיזו רמת פירוט — ומדוע בחרתם ברמת פירוט זו עבורם?</w:t>
+        <w:t xml:space="preserve">1.2 (3 נק') בתהליך משתתפים, לצד חברת הניהול, גם הדייר היוצא וגם הבנק. כיצד ייצגתם בתרשים שלכם את התהליך הפנימי של כל אחד משני המשתתפים הללו, ובאיזו רמת פירוט, ומדוע בחרתם ברמת פירוט זו עבורם?</w:t>
       </w:r>
     </w:p>
     <w:p>
@@ -791,7 +791,7 @@
           <w:szCs w:val="24"/>
           <w:rtl/>
         </w:rPr>
-        <w:t xml:space="preserve">1.3 (3 נק') התהליך כולל שתי הכרעות: האחת ניתנת לחישוב אוטומטי (האם הודעת העזיבה הוגשה 30 יום לפני מועד סיום השכירות), והשנייה מחייבת שיפוט אנושי (האם נגרם נזק ומהי עלות תיקונו). על מי הטלתם בתרשים שלכם את האחריות לכל אחת מן ההכרעות, כיצד ייצגתם את ההבחנה ביניהן — ומדוע חילקתם כך?</w:t>
+        <w:t xml:space="preserve">1.3 (3 נק') התהליך כולל שתי הכרעות: האחת ניתנת לחישוב אוטומטי (האם הודעת העזיבה הוגשה 30 יום לפני מועד סיום השכירות), והשנייה מחייבת שיפוט אנושי (האם נגרם נזק ומהי עלות תיקונו). על מי הטלתם בתרשים שלכם את האחריות לכל אחת מן ההכרעות, כיצד ייצגתם את ההבחנה ביניהן, ומדוע חילקתם כך?</w:t>
       </w:r>
     </w:p>
     <w:p>
@@ -865,7 +865,7 @@
           <w:szCs w:val="24"/>
           <w:rtl/>
         </w:rPr>
-        <w:t xml:space="preserve">א. (4 נק') אמירה זו אינה יכולה לשמש כדרישה במסמך האפיון. זהו לפחות שלושה ליקויים בניסוח, וציינו לגבי כל אחד מהם איזו תכונה של דרישה טובה הוא מפר (למשל: חד-משמעות, ניתנוּת לאימות/מדידה, אטומיוּת — דרישה אחת בכל משפט, ציון השחקן והאירוע המפעיל).</w:t>
+        <w:t xml:space="preserve">א. (4 נק') אמירה זו אינה יכולה לשמש כדרישה במסמך האפיון. זהו לפחות שלושה ליקויים בניסוח, וציינו לגבי כל אחד מהם איזו תכונה של דרישה טובה הוא מפר (למשל: חד-משמעות, ניתנוּת לאימות/מדידה, אטומיוּת (דרישה אחת בכל משפט), וכן ציון השחקן והאירוע המפעיל).</w:t>
       </w:r>
     </w:p>
     <w:p>
@@ -901,7 +901,7 @@
           <w:szCs w:val="24"/>
           <w:rtl/>
         </w:rPr>
-        <w:t xml:space="preserve">ג. (3 נק') הסבירו את המחיר של השארת הדרישה בניסוחה העמום בהמשך הפרויקט. התייחסו לשני תוצרים: (1) תכנון הבדיקות וקבלת המערכת — מה יקרה ביום שבו החברה תבוא לאשר שהדרישה מומשה; (2) אומדן העלות ולוח הזמנים — מה יקרה לאומדן שהוגש על בסיס דרישה כזו. תנו דוגמה קונקרטית אחת לכל תוצר, מתוך עולם התוכן של "קמפוס בית".</w:t>
+        <w:t xml:space="preserve">ג. (3 נק') הסבירו את המחיר של השארת הדרישה בניסוחה העמום בהמשך הפרויקט. התייחסו לשני תוצרים: (1) תכנון הבדיקות וקבלת המערכת: מה יקרה ביום שבו החברה תבוא לאשר שהדרישה מומשה; (2) אומדן העלות ולוח הזמנים: מה יקרה לאומדן שהוגש על בסיס דרישה כזו. תנו דוגמה קונקרטית אחת לכל תוצר, מתוך עולם התוכן של "קמפוס בית".</w:t>
       </w:r>
     </w:p>
     <w:p>
@@ -956,7 +956,7 @@
           <w:szCs w:val="24"/>
           <w:rtl/>
         </w:rPr>
-        <w:t xml:space="preserve">א. (6 נק') להלן ארבעה תפקידים בפרויקט פיתוח מערכות מידע: Business Analyst (BA), Product Owner (PO), Scrum Master, Project Manager (PM). עבור כל אחד מהתפקידים: (1) הסבירו במשפט אחד מהי האחריות המרכזית שלו; (2) תארו משימה קונקרטית אחת שהוא יבצע דווקא בפרויקט "קמפוס בית" (הסתמכו על שחקני הסיפור וכלליו — רכז השיבוץ, מנהל האזור, אב הבית, הקבלנים, כלל עשרת הימים לפיגור, הממשק היומי מול מערכת הסליקה). (1.5 נק' לכל תפקיד)</w:t>
+        <w:t xml:space="preserve">א. (6 נק') להלן ארבעה תפקידים בפרויקט פיתוח מערכות מידע: Business Analyst (BA), Product Owner (PO), Scrum Master, Project Manager (PM). עבור כל אחד מהתפקידים: (1) הסבירו במשפט אחד מהי האחריות המרכזית שלו; (2) תארו משימה קונקרטית אחת שהוא יבצע דווקא בפרויקט "קמפוס בית" (הסתמכו על שחקני הסיפור וכלליו: רכז השיבוץ, מנהל האזור, אב הבית, הקבלנים, כלל עשרת הימים לפיגור, הממשק היומי מול מערכת הסליקה). (1.5 נק' לכל תפקיד)</w:t>
       </w:r>
     </w:p>
     <w:p>
@@ -1047,25 +1047,25 @@
           <w:szCs w:val="24"/>
           <w:rtl/>
         </w:rPr>
-        <w:t xml:space="preserve">ב. (2 נק') תארו דוגמה אחת ל-Gold-Plating שעלולה להתרחש דווקא בפרויקט "קמפוס בית", והסבירו מה נזקה לפרויקט (זמן, עלות, בדיקות, תחזוקה — בחרו והנמקו).</w:t>
-      </w:r>
-    </w:p>
-    <w:p>
-      <w:pPr>
-        <w:bidi/>
-        <w:spacing w:before="120" w:line="360" w:lineRule="auto"/>
-        <w:rPr>
-          <w:sz w:val="24"/>
-          <w:szCs w:val="24"/>
-        </w:rPr>
-      </w:pPr>
-      <w:r>
-        <w:rPr>
-          <w:sz w:val="24"/>
-          <w:szCs w:val="24"/>
-          <w:rtl/>
-        </w:rPr>
-        <w:t xml:space="preserve">ג. (3 נק') מהו לדעתכם גורם הסיכון המרכזי בפרויקט "קמפוס בית"? נמקו על סמך שני מאפיינים של הפרויקט (למשל: המצב הקיים המבוסס אקסל, טפסי נייר ושיחות טלפון; התלות בקובץ התשלומים היומי שמעבירה מערכת הסליקה החיצונית; ריבוי סוגי המשתמשים, ובהם משתמש חיצוני — הקבלן; פעולות אוטומטיות מונעות-זמן, כגון הפקת החיוב ב-1 לחודש וסימון "בפיגור" לאחר עשרה ימים). לסיום, תארו פעולה קונקרטית אחת שהייתם נוקטים כבר בשלב הניתוח והאפיון כדי להקטין סיכון זה, וציינו איזו גישת פיתוח (מתודולוגיה) תומכת בפעולה זו ומדוע.</w:t>
+        <w:t xml:space="preserve">ב. (2 נק') תארו דוגמה אחת ל-Gold-Plating שעלולה להתרחש דווקא בפרויקט "קמפוס בית", והסבירו מה נזקה לפרויקט (בחרו והנמקו מבחינת זמן, עלות, בדיקות או תחזוקה).</w:t>
+      </w:r>
+    </w:p>
+    <w:p>
+      <w:pPr>
+        <w:bidi/>
+        <w:spacing w:before="120" w:line="360" w:lineRule="auto"/>
+        <w:rPr>
+          <w:sz w:val="24"/>
+          <w:szCs w:val="24"/>
+        </w:rPr>
+      </w:pPr>
+      <w:r>
+        <w:rPr>
+          <w:sz w:val="24"/>
+          <w:szCs w:val="24"/>
+          <w:rtl/>
+        </w:rPr>
+        <w:t xml:space="preserve">ג. (3 נק') מהו לדעתכם גורם הסיכון המרכזי בפרויקט "קמפוס בית"? נמקו על סמך שני מאפיינים של הפרויקט (למשל: המצב הקיים המבוסס אקסל, טפסי נייר ושיחות טלפון; התלות בקובץ התשלומים היומי שמעבירה מערכת הסליקה החיצונית; ריבוי סוגי המשתמשים, ובהם משתמש חיצוני, הקבלן; פעולות אוטומטיות מונעות-זמן, כגון הפקת החיוב ב-1 לחודש וסימון "בפיגור" לאחר עשרה ימים). לסיום, תארו פעולה קונקרטית אחת שהייתם נוקטים כבר בשלב הניתוח והאפיון כדי להקטין סיכון זה, וציינו איזו גישת פיתוח (מתודולוגיה) תומכת בפעולה זו ומדוע.</w:t>
       </w:r>
     </w:p>
     <w:p>
@@ -1317,7 +1317,7 @@
           <w:szCs w:val="24"/>
           <w:rtl/>
         </w:rPr>
-        <w:t xml:space="preserve">7.1 (8 נק') הכינו תרשים מחלקות מקיף עבור המערכת המתוארת בסיפור המסגרת (שוב — אין להתייחס למופיע בשאלה 1). על התרשים לכלול שימוש נכון ב-enumerator, מאפיינים מהותיים וכן קרדינליות הקשרים. יש לציין את המאפיינים כפי שתוארו בשאלה, אך אין צורך לציין סוגי משתנים או הגדרות private/public. שיטות רלוונטיות יש להציג. התרשים עצמו נבדק בצורה כללית לבחינת השימוש הנכון בסימונים ובהבנת מהות התרשים.</w:t>
+        <w:t xml:space="preserve">7.1 (8 נק') הכינו תרשים מחלקות מקיף עבור המערכת המתוארת בסיפור המסגרת (שוב, אין להתייחס למופיע בשאלה 1). על התרשים לכלול שימוש נכון ב-enumerator, מאפיינים מהותיים וכן קרדינליות הקשרים. יש לציין את המאפיינים כפי שתוארו בשאלה, אך אין צורך לציין סוגי משתנים או הגדרות private/public. שיטות רלוונטיות יש להציג. התרשים עצמו נבדק בצורה כללית לבחינת השימוש הנכון בסימונים ובהבנת מהות התרשים.</w:t>
       </w:r>
     </w:p>
     <w:p>
@@ -1491,7 +1491,7 @@
           <w:szCs w:val="24"/>
           <w:rtl/>
         </w:rPr>
-        <w:t xml:space="preserve">8.2 (2 נק') מנהל האזור עשוי להחזיר חוזה לרכז השיבוץ לתיקון, ולאחר התיקון החוזה מוגש שוב לאישור — וכך ייתכן שיחזור הדבר כמה פעמים. כיצד ייצגתם בתרשים שלכם את האפשרות שאותו חוזה ייבדק, יוחזר ויוגש שוב יותר מפעם אחת?</w:t>
+        <w:t xml:space="preserve">8.2 (2 נק') מנהל האזור עשוי להחזיר חוזה לרכז השיבוץ לתיקון, ולאחר התיקון החוזה מוגש שוב לאישור, וכך ייתכן שיחזור הדבר כמה פעמים. כיצד ייצגתם בתרשים שלכם את האפשרות שאותו חוזה ייבדק, יוחזר ויוגש שוב יותר מפעם אחת?</w:t>
       </w:r>
     </w:p>
     <w:p>

</xml_diff>